<commit_message>
Update docx file - new feature
</commit_message>
<xml_diff>
--- a/co można dodać.docx
+++ b/co można dodać.docx
@@ -347,6 +347,13 @@
         </w:rPr>
         <w:t>Dodatkowo</w:t>
       </w:r>
+      <w:r>
+        <w:rPr>
+          <w:b/>
+          <w:bCs/>
+        </w:rPr>
+        <w:t xml:space="preserve"> (priorytetowo)</w:t>
+      </w:r>
     </w:p>
     <w:p>
       <w:pPr>
@@ -373,6 +380,18 @@
       </w:r>
       <w:r>
         <w:t xml:space="preserve"> aplikacji</w:t>
+      </w:r>
+    </w:p>
+    <w:p>
+      <w:pPr>
+        <w:pStyle w:val="Akapitzlist"/>
+        <w:numPr>
+          <w:ilvl w:val="0"/>
+          <w:numId w:val="7"/>
+        </w:numPr>
+      </w:pPr>
+      <w:r>
+        <w:t>Plik, który będzie przykładem pliku .env – do skopiowania dla użytkownika</w:t>
       </w:r>
     </w:p>
     <w:p/>

</xml_diff>